<commit_message>
Proposal v4: wording pass, team order, plain 13 GB line; prior versions moved to docs/proposal/superseded/
Co-Authored-By: Claude Fable 5.1 <noreply@anthropic.com>
</commit_message>
<xml_diff>
--- a/docs/proposal/Proposal_v4_FINAL.docx
+++ b/docs/proposal/Proposal_v4_FINAL.docx
@@ -31,7 +31,7 @@
         </w:rPr>
         <w:tab/>
       </w:r>
-      <w:hyperlink w:history="1" r:id="rIdsgacvwbvsmufg34zay63g">
+      <w:hyperlink w:history="1" r:id="rId4okqgfhfkk9ctawbiansl">
         <w:r>
           <w:rPr>
             <w:rFonts w:ascii="Calibri" w:cs="Calibri" w:eastAsia="Calibri" w:hAnsi="Calibri"/>
@@ -83,7 +83,7 @@
           <w:sz w:val="22"/>
           <w:szCs w:val="22"/>
         </w:rPr>
-        <w:t xml:space="preserve">Which first-time donors will give again, and which ones a small nonprofit should spend its scarce staff hours on.</w:t>
+        <w:t xml:space="preserve">Which first-time donors will give again, and which ones a small nonprofit should spend staff time on.</w:t>
       </w:r>
     </w:p>
     <w:p>
@@ -114,7 +114,7 @@
           <w:sz w:val="20"/>
           <w:szCs w:val="20"/>
         </w:rPr>
-        <w:t xml:space="preserve">Bakul Badwal · Malorie Black · Reid Jacobson · Thadeus Knospe · Rodolfo Perez-Cortes Manrique</w:t>
+        <w:t xml:space="preserve">Malorie Black · Reid Jacobson · Thadeus Knospe · Rodolfo Perez-Cortes Manrique · Bakul Badwal</w:t>
       </w:r>
     </w:p>
     <w:p>
@@ -153,7 +153,7 @@
           <w:sz w:val="20"/>
           <w:szCs w:val="20"/>
         </w:rPr>
-        <w:t xml:space="preserve">Most nonprofits acquire a donor once and never hear from them again. The second gift is the highest-leverage moment in the donor lifecycle, and small organizations are the least equipped to work it. Our stakeholder is the development lead at a nonprofit with roughly a $500K budget and no data staff: each month she can personally follow up with only a fraction of first-time donors, and today she builds that list by hand from recency and gift size.</w:t>
+        <w:t xml:space="preserve">Most nonprofits acquire a donor once and never hear from them again. The second gift is where retention is won or lost, and small organizations have the least capacity to work it. Our stakeholder is the development lead at a nonprofit with roughly a $500K budget and no data staff. Each month she can personally follow up with only a fraction of first-time donors, and today she builds that list by hand from recency and gift size.</w:t>
       </w:r>
     </w:p>
     <w:p>
@@ -171,43 +171,19 @@
           <w:sz w:val="20"/>
           <w:szCs w:val="20"/>
         </w:rPr>
-        <w:t xml:space="preserve">The decision is specific: </w:t>
-      </w:r>
-      <w:r>
-        <w:rPr>
-          <w:rFonts w:ascii="Calibri" w:cs="Calibri" w:eastAsia="Calibri" w:hAnsi="Calibri"/>
-          <w:b w:val="false"/>
-          <w:bCs w:val="false"/>
-          <w:i w:val="false"/>
-          <w:iCs w:val="false"/>
-          <w:sz w:val="20"/>
-          <w:szCs w:val="20"/>
-        </w:rPr>
-        <w:t xml:space="preserve">given a fixed outreach budget in staff hours, which first-time donors receive follow-up, and where does the cutoff sit? Our output is a ranked follow-up list with a recommended threshold and the expected dollars behind it. One of us founded GoGood Technologies, a donor-engagement platform serving exactly this customer, so real practitioners can check the output. </w:t>
-      </w:r>
-      <w:r>
-        <w:rPr>
-          <w:rFonts w:ascii="Calibri" w:cs="Calibri" w:eastAsia="Calibri" w:hAnsi="Calibri"/>
-          <w:b/>
-          <w:bCs/>
-          <w:i w:val="false"/>
-          <w:iCs w:val="false"/>
-          <w:sz w:val="20"/>
-          <w:szCs w:val="20"/>
-        </w:rPr>
-        <w:t xml:space="preserve">In practice: </w:t>
-      </w:r>
-      <w:r>
-        <w:rPr>
-          <w:rFonts w:ascii="Calibri" w:cs="Calibri" w:eastAsia="Calibri" w:hAnsi="Calibri"/>
-          <w:b w:val="false"/>
-          <w:bCs w:val="false"/>
-          <w:i w:val="false"/>
-          <w:iCs w:val="false"/>
-          <w:sz w:val="20"/>
-          <w:szCs w:val="20"/>
-        </w:rPr>
-        <w:t xml:space="preserve">the hand-built list becomes a scored one, and the budget question gets a number.</w:t>
+        <w:t xml:space="preserve">The decision: </w:t>
+      </w:r>
+      <w:r>
+        <w:rPr>
+          <w:rFonts w:ascii="Calibri" w:cs="Calibri" w:eastAsia="Calibri" w:hAnsi="Calibri"/>
+          <w:b w:val="false"/>
+          <w:bCs w:val="false"/>
+          <w:i w:val="false"/>
+          <w:iCs w:val="false"/>
+          <w:sz w:val="20"/>
+          <w:szCs w:val="20"/>
+        </w:rPr>
+        <w:t xml:space="preserve">given a fixed outreach budget in staff hours, which first-time donors get a follow-up, and where does the cutoff sit? Our output is a ranked follow-up list with a recommended threshold and the expected dollars behind it. One of us founded GoGood Technologies, a donor-engagement platform whose customers are this stakeholder, so practitioners can check the output. Deployed, it replaces the hand-built list and puts a number on the budget question.</w:t>
       </w:r>
     </w:p>
     <w:p>
@@ -449,7 +425,7 @@
           <w:sz w:val="20"/>
           <w:szCs w:val="20"/>
         </w:rPr>
-        <w:t xml:space="preserve">Scoring a year of first-time donors is a batch job on one machine, no API spend. The operating cost is the staff hours the threshold allocates, reported explicitly.</w:t>
+        <w:t xml:space="preserve">Scoring a year of first-time donors is a batch job on one machine, with no API spend. The operating cost is the staff hours the threshold allocates, and we report it.</w:t>
       </w:r>
     </w:p>
     <w:p>
@@ -719,7 +695,7 @@
           <w:sz w:val="20"/>
           <w:szCs w:val="20"/>
         </w:rPr>
-        <w:t xml:space="preserve">Guidance on ~13 GB on JupyterHub, or approval to use a stratified sample of donor cohorts.</w:t>
+        <w:t xml:space="preserve">The two files total about 13 GB, more than JupyterHub comfortably holds. Either guidance on working with them there, or approval to use a stratified sample of donor cohorts.</w:t>
       </w:r>
     </w:p>
     <w:p>

</xml_diff>